<commit_message>
docs: organize testing presentation into four clear chapters
</commit_message>
<xml_diff>
--- a/docs/presentations/nhom-11-23cn2/Doi_chieu_va_anh_can_bo_sung.docx
+++ b/docs/presentations/nhom-11-23cn2/Doi_chieu_va_anh_can_bo_sung.docx
@@ -14,7 +14,7 @@
     </w:p>
     <w:p>
       <w:r>
-        <w:t>Đi kèm Nhom_11_23CN2_Kiem_thu_PC_DSS.pptx — 18 slide có thể chỉnh sửa, ghi chú đầy đủ trong Notes. Tổng thời gian nói gợi ý: 12 phút 25 giây, chưa tính demo. Không đọc video; không chạy lại test để thay kết quả gốc.</w:t>
+        <w:t>Đi kèm Nhom_11_23CN2_Kiem_thu_PC_DSS.pptx — 18 slide có thể chỉnh sửa, ghi chú đầy đủ trong Notes. Tổng thời gian nói gợi ý: 12 phút 55 giây, chưa tính demo. Không đọc video; không chạy lại test để thay kết quả gốc.</w:t>
       </w:r>
     </w:p>
     <w:p>
@@ -387,7 +387,7 @@
           </w:tcPr>
           <w:p>
             <w:r>
-              <w:t>6, 14</w:t>
+              <w:t>8, 14</w:t>
             </w:r>
           </w:p>
         </w:tc>
@@ -419,7 +419,7 @@
           </w:tcPr>
           <w:p>
             <w:r>
-              <w:t>12</w:t>
+              <w:t>13</w:t>
             </w:r>
           </w:p>
         </w:tc>
@@ -515,7 +515,7 @@
           </w:tcPr>
           <w:p>
             <w:r>
-              <w:t>7 (tùy chọn)</w:t>
+              <w:t>9 (tùy chọn)</w:t>
             </w:r>
           </w:p>
         </w:tc>
@@ -547,7 +547,7 @@
           </w:tcPr>
           <w:p>
             <w:r>
-              <w:t>9 (tùy chọn)</w:t>
+              <w:t>10 (tùy chọn)</w:t>
             </w:r>
           </w:p>
         </w:tc>
@@ -583,7 +583,7 @@
     </w:p>
     <w:p>
       <w:r>
-        <w:t>Slide 7: ảnh thật Word Hình 4.1. Slide 9: vùng cắt từ ảnh Word Hình 4.4.4.2 có response, cùng bảng dữ liệu từ PM-029-response.json và Excel. Slide 11: vùng tổng kết ảnh Runner thật. Vùng cắt dùng thuộc tính crop của PowerPoint; ảnh gốc được giữ trong tệp. Các bảng, sơ đồ và mã trích là đối tượng có thể chỉnh sửa, không được trình bày như ảnh chụp hệ thống.</w:t>
+        <w:t>Slide 9: ảnh thật Word Hình 4.1. Slide 10: vùng cắt từ ảnh Word Hình 4.4.4.2 có response, cùng bảng dữ liệu từ PM-029-response.json và Excel. Slide 12: vùng tổng kết ảnh Runner thật. Vùng cắt dùng thuộc tính crop của PowerPoint; ảnh gốc được giữ trong tệp. Các bảng, sơ đồ và mã trích là đối tượng có thể chỉnh sửa, không được trình bày như ảnh chụp hệ thống.</w:t>
       </w:r>
     </w:p>
     <w:p>
@@ -593,7 +593,7 @@
     </w:p>
     <w:p>
       <w:r>
-        <w:t>Trong PowerPoint: View → Notes hoặc bật vùng Notes ở dưới slide. Mỗi slide có lời nói ngắn, thời lượng, nguồn và việc cần bổ sung. Dùng Presenter View khi trình chiếu. Slide 16 tóm tắt việc đồng bộ tài liệu; có thể trình bày nhanh 35 giây.</w:t>
+        <w:t>Trong PowerPoint: mở View → Notes hoặc bật vùng Notes dưới slide. Mỗi slide có lời nói ngắn, thời lượng, nguồn và lưu ý cần bổ sung. Bản sửa có mục lục và 4 chương; các lưu ý nội bộ nằm trong ghi chú. Dùng Presenter View khi trình chiếu.</w:t>
       </w:r>
     </w:p>
     <w:p>

</xml_diff>